<commit_message>
fix: standardize gitignore, eliminate artificial runtime modes, and synchronize empirical benchmark metrics
</commit_message>
<xml_diff>
--- a/BAO_CAO_BTVN3.docx
+++ b/BAO_CAO_BTVN3.docx
@@ -18,14 +18,14 @@
     </w:p>
     <w:p>
       <w:pPr>
-        <w:spacing w:before="360" w:after="360"/>
+        <w:spacing w:before="320" w:after="320"/>
         <w:jc w:val="center"/>
       </w:pPr>
       <w:r>
         <w:rPr>
           <w:b/>
           <w:color w:val="102C57"/>
-          <w:sz w:val="32"/>
+          <w:sz w:val="30"/>
         </w:rPr>
         <w:t>BÁO CÁO KỸ THUẬT BÀI TẬP THỰC HÀNH BUỔI 03 (BTVN#3)</w:t>
         <w:br/>
@@ -43,9 +43,9 @@
         </w:rPr>
         <w:t>Môn học: SE373 - Kỹ thuật xây dựng hệ thống Agentic AI</w:t>
         <w:br/>
-        <w:t>Nguyên tắc cốt lõi: agent = model + harness (Model cấp năng lực, Harness cấp độ tin cậy)</w:t>
+        <w:t>Nguyên tắc cốt lõi: agent = model + harness (Model cấp năng lực suy luận, Harness cấp độ tin cậy và bảo vệ thực thi)</w:t>
         <w:br/>
-        <w:t>Ngôn ngữ và Framework: Python 3.13, LangChain 1.4, LangGraph, Pydantic</w:t>
+        <w:t>Công nghệ áp dụng: Python 3.13, LangChain 1.4, LangGraph, Pydantic 2.12</w:t>
       </w:r>
     </w:p>
     <w:p>
@@ -67,7 +67,7 @@
     </w:p>
     <w:p>
       <w:r>
-        <w:t>Bài toán yêu cầu xây dựng hệ thống tác tử (Agent) hỗ trợ người dùng tìm kiếm và đặt vé máy bay theo ngôn ngữ tự nhiên. Mô hình ngôn ngữ (LLM) đảm nhiệm việc phân tích ngữ nghĩa và sinh lời gọi công cụ, trong khi lớp điều khiển (Harness) đảm bảo toàn bộ thao tác tuân thủ các ràng buộc nghiệp vụ, bảo vệ tài nguyên và xác thực kết quả khách quan.</w:t>
+        <w:t>Hệ thống tác tử (Agent) tiếp nhận yêu cầu đặt vé máy bay từ người dùng bằng ngôn ngữ tự nhiên. Mô hình ngôn ngữ (LLM) đảm nhiệm việc phân tích ngữ nghĩa và sinh các lời gọi công cụ, trong khi lớp điều khiển (Harness) đảm bảo toàn bộ thao tác tuân thủ các ràng buộc nghiệp vụ, bảo vệ tài nguyên, kiểm soát quyền hạn và xác thực kết quả khách quan.</w:t>
       </w:r>
     </w:p>
     <w:p>
@@ -145,7 +145,7 @@
               <w:rPr>
                 <w:b/>
               </w:rPr>
-              <w:t>Cơ chế xử lý lỗi ngầm</w:t>
+              <w:t>Cơ chế xử lý lỗi ngữ nghĩa</w:t>
             </w:r>
           </w:p>
         </w:tc>
@@ -187,7 +187,7 @@
           </w:tcPr>
           <w:p>
             <w:r>
-              <w:t>Kiểm tra regex YYYY-MM-DD. Sai định dạng trả về invalid_param kèm hint (Slide 56).</w:t>
+              <w:t>Kiểm tra định dạng regex YYYY-MM-DD. Nếu sai trả về invalid_param kèm gợi ý sửa lỗi (Slide 56).</w:t>
             </w:r>
           </w:p>
         </w:tc>
@@ -271,7 +271,7 @@
           </w:tcPr>
           <w:p>
             <w:r>
-              <w:t>Kiểm tra tính khả dụng của ghế; cập nhật trạng thái giữ chỗ (held).</w:t>
+              <w:t>Kiểm tra tính khả dụng của ghế; cập nhật trạng thái giữ chỗ (held) và cấp mã PNR.</w:t>
             </w:r>
           </w:p>
         </w:tc>
@@ -355,7 +355,7 @@
           </w:tcPr>
           <w:p>
             <w:r>
-              <w:t>Truy vấn cơ sở dữ liệu phục vụ vị từ kiểm chứng máy móc (Slide 43).</w:t>
+              <w:t>Truy vấn cơ sở dữ liệu phục vụ vị từ kiểm chứng bằng code (Slide 43).</w:t>
             </w:r>
           </w:p>
         </w:tc>
@@ -380,12 +380,12 @@
         <w:spacing w:before="280"/>
       </w:pPr>
       <w:r>
-        <w:t>2. THIẾT KẾ VÀ CÀI ĐẶT 4 LỚP HARNESS BẢO VỆ</w:t>
+        <w:t>2. THIẾT KẾ VÀ CÀI ĐẶT 4 LỚP HARNESS BẢO VỆ (THEO SLIDE BUỔI 03)</w:t>
       </w:r>
     </w:p>
     <w:p>
       <w:r>
-        <w:t>Lớp Harness bao bọc toàn bộ vòng lặp của Agent, thực thi theo đúng thứ tự ưu tiên của Checklist kiểm tra (Slide 35 Buổi 03):</w:t>
+        <w:t>Lớp Harness bao bọc toàn bộ vòng lặp của Agent, thực thi theo đúng thứ tự ưu tiên của Checklist kiểm tra an toàn (Slide 35 Buổi 03):</w:t>
       </w:r>
     </w:p>
     <w:p>
@@ -398,7 +398,7 @@
     </w:p>
     <w:p>
       <w:r>
-        <w:t>Ràng buộc nghiệp vụ không để trong câu nhắc văn bản mà được cấu trúc hóa thành Pydantic schema (FlightConstraints) gồm: origin='SGN', destination='DAD', date='2026-10-07', depart_before='12:00', max_price=2_000_000 VNĐ. Lớp ConstraintValidator kiểm tra dữ liệu trước khi hành động book_seat được gọi. Nếu chuyến bay vi phạm giờ bay (sau 12:00) hoặc vượt ngân sách, Harness chặn hành động ngay tại cổng ra vào.</w:t>
+        <w:t>Ràng buộc nghiệp vụ không để trong câu nhắc văn bản tự do mà được cấu trúc hóa thành Pydantic schema (FlightConstraints) gồm: origin='SGN', destination='DAD', date='2026-10-07', depart_before='12:00', max_price=2.000.000 VNĐ. Lớp ConstraintValidator kiểm tra dữ liệu trước khi hành động book_seat được gọi. Nếu chuyến bay vi phạm giờ cất cánh (sau 12:00) hoặc vượt ngân sách, Harness chặn hành động ngay tại cổng ra vào.</w:t>
       </w:r>
     </w:p>
     <w:p>
@@ -411,11 +411,11 @@
     </w:p>
     <w:p>
       <w:r>
-        <w:t>Sử dụng hàm vị từ boolean khách quan (Sensor Computational) kiểm tra trực tiếp trạng thái cơ sở dữ liệu, độc lập tuyệt đối với việc mô hình tự tuyên bố hoàn thành:</w:t>
+        <w:t>Sử dụng hàm vị từ Boolean khách quan (ComputationalVerifier) kiểm tra trực tiếp trạng thái cơ sở dữ liệu vật lý, độc lập tuyệt đối với việc mô hình tự tuyên bố hoàn thành:</w:t>
         <w:br/>
-        <w:t>get_booking(code).status == 'confirmed' and paid == True and price &lt;= 2_000_000 and depart_date == '2026-10-07' and depart_time &lt; '12:00'</w:t>
+        <w:t>get_booking(code).status == 'confirmed' and paid == True and price &lt;= 2.000.000 and depart_date == '2026-10-07' and depart_time &lt; '12:00'</w:t>
         <w:br/>
-        <w:t>Đặc tính: Thực thi tính bằng microsecond, tiêu thụ 0 token, loại bỏ hoàn toàn rủi ro sai sót phán đoán của LLM.</w:t>
+        <w:t>Đặc tính: Thực thi tính bằng microsecond, tiêu thụ 0 token, loại bỏ hoàn toàn rủi ro ảo giác (hallucination) của LLM.</w:t>
       </w:r>
     </w:p>
     <w:p>
@@ -441,13 +441,13 @@
     </w:p>
     <w:p>
       <w:r>
-        <w:t>Khi hệ thống cần phê duyệt hoặc gặp sự cố bế tắc, lớp HandoffReport đóng gói ngữ cảnh thành 4 trường thông tin súc tích:</w:t>
+        <w:t>Khi hệ thống cần phê duyệt hoặc gặp sự cố bế tắc, lớp HumanHandoffManager đóng gói ngữ cảnh thành cấu trúc 4 trường thông tin súc tích:</w:t>
         <w:br/>
         <w:t>1. Current Status: Trạng thái hiện tại và các thao tác đã thực hiện.</w:t>
         <w:br/>
-        <w:t>2. Tried Attempts: Các phương án đã thử và lý do thất bại.</w:t>
+        <w:t>2. Tried Attempts: Các phương án đã thử và lý do cần can thiệp.</w:t>
         <w:br/>
-        <w:t>3. Agent Recommendation: Đề xuất kỹ thuật tối ưu.</w:t>
+        <w:t>3. Agent Recommendation: Đề xuất kỹ thuật tối ưu nhất.</w:t>
         <w:br/>
         <w:t>4. Specific Question: Câu hỏi quyết định đóng (Yes/No) giúp người vận hành đưa ra phản hồi tức thì.</w:t>
       </w:r>
@@ -457,16 +457,16 @@
         <w:pStyle w:val="Heading2"/>
       </w:pPr>
       <w:r>
-        <w:t>2.5. Các cơ chế bổ trợ (LoopDetector, GroundingSensor, Budget)</w:t>
+        <w:t>2.5. Các cơ chế bổ trợ chống thất bại (Failure Mode Protections)</w:t>
       </w:r>
     </w:p>
     <w:p>
       <w:r>
-        <w:t>• LoopDetector (Slide 46): Sử dụng hàng đợi deque(maxlen=window) đối chiếu dấu vân tay fp = (tool, repr(sorted(args.items()))) với ngưỡng repeat_k=2 để ngắt lặp; theo dõi biến tiến độ với stall_n=5 để ngắt bế tắc.</w:t>
+        <w:t>• LoopDetector (Slide 46): Sử dụng hàng đợi deque(maxlen=10) đối chiếu dấu vân tay fp = (tool, repr(sorted(args.items()))) với ngưỡng repeat_k=2 để ngắt lặp; theo dõi biến tiến độ với stall_n=5 để ngắt bế tắc.</w:t>
         <w:br/>
         <w:t>• GroundingSensor (Slide 59): Đối chiếu chéo mã chuyến bay, số ghế và giá vé do agent phát ngôn với tập dữ liệu công cụ trả về để chống Hallucination.</w:t>
         <w:br/>
-        <w:t>• ExecutionBudget (Slide 15, 38): Quản lý trần cứng số bước lặp, token và thời gian timeout. Được kiểm tra cuối cùng trong chu trình để không làm mất chẩn đoán lỗi.</w:t>
+        <w:t>• ExecutionBudget (Slide 15, 38): Quản lý trần cứng số bước lặp (tối đa 10 bước), token (50.000 tokens) và thời gian timeout (30 giây).</w:t>
       </w:r>
     </w:p>
     <w:p>
@@ -487,7 +487,7 @@
         <w:spacing w:before="280"/>
       </w:pPr>
       <w:r>
-        <w:t>3. CÀI ĐẶT 3 MẪU THIẾT KẾ AGENT VỚI LANGCHAIN &amp; LANGGRAPH</w:t>
+        <w:t>3. CÀI ĐẶT 3 MẪU THIẾT KẾ AGENT VỚI LANGCHAIN</w:t>
       </w:r>
     </w:p>
     <w:p>
@@ -513,7 +513,7 @@
     </w:p>
     <w:p>
       <w:r>
-        <w:t>Chia làm 3 giai đoạn độc lập: (1) Planner sinh trọn vẹn kế hoạch 5 bước; (2) PlanReviewer thẩm định tính an toàn và chi phí; (3) Executor thực thi tuần tự các bước. Ưu điểm là chi phí thấp và kiểm soát ngân sách trước khi chạy; nhược điểm là kế hoạch tĩnh bị giòn (brittle) — nếu bước giữa thất bại (ví dụ chuyến bay hết ghế), hệ thống không thể tự phục hồi.</w:t>
+        <w:t>Chia làm 3 giai đoạn độc lập: (1) Planner sinh trọn vẹn kế hoạch tuần tự; (2) PlanReviewer thẩm định tính an toàn và chi phí kế hoạch trước khi chạy; (3) Executor thực thi tuần tự các bước. Ưu điểm là chi phí thấp và kiểm soát ngân sách trước khi chạy; nhược điểm là kế hoạch tĩnh bị giòn (brittle) — nếu bước giữa thất bại (ví dụ chuyến bay hết ghế), hệ thống không thể tự phục hồi.</w:t>
       </w:r>
     </w:p>
     <w:p>
@@ -547,7 +547,7 @@
         <w:spacing w:before="280"/>
       </w:pPr>
       <w:r>
-        <w:t>4. ĐÁNH GIÁ SO SÁNH THỰC NGHIỆM VÀ PHÂN TÍCH ĐỊNH LƯỢNG</w:t>
+        <w:t>4. ĐÁNH GIÁ SO SÁNH HIỆU QUẢ CỦA 3 MẪU THIẾT KẾ (SLIDE 31)</w:t>
       </w:r>
     </w:p>
     <w:p>
@@ -644,7 +644,7 @@
           </w:tcPr>
           <w:p>
             <w:r>
-              <w:t>60.0%</w:t>
+              <w:t>20.0% (1/5)</w:t>
             </w:r>
           </w:p>
         </w:tc>
@@ -654,7 +654,7 @@
           </w:tcPr>
           <w:p>
             <w:r>
-              <w:t>40.0%</w:t>
+              <w:t>20.0% (1/5)</w:t>
             </w:r>
           </w:p>
         </w:tc>
@@ -664,7 +664,7 @@
           </w:tcPr>
           <w:p>
             <w:r>
-              <w:t>60.0%</w:t>
+              <w:t>20.0% (1/5)</w:t>
             </w:r>
           </w:p>
         </w:tc>
@@ -686,7 +686,7 @@
           </w:tcPr>
           <w:p>
             <w:r>
-              <w:t>5.0 bước</w:t>
+              <w:t>3.4 bước</w:t>
             </w:r>
           </w:p>
         </w:tc>
@@ -696,7 +696,7 @@
           </w:tcPr>
           <w:p>
             <w:r>
-              <w:t>3.2 bước</w:t>
+              <w:t>2.4 bước</w:t>
             </w:r>
           </w:p>
         </w:tc>
@@ -706,7 +706,7 @@
           </w:tcPr>
           <w:p>
             <w:r>
-              <w:t>4.0 bước</w:t>
+              <w:t>3.0 bước</w:t>
             </w:r>
           </w:p>
         </w:tc>
@@ -728,7 +728,7 @@
           </w:tcPr>
           <w:p>
             <w:r>
-              <w:t>20,800 tokens</w:t>
+              <w:t>12,700 tokens</w:t>
             </w:r>
           </w:p>
         </w:tc>
@@ -738,7 +738,7 @@
           </w:tcPr>
           <w:p>
             <w:r>
-              <w:t>1,800 tokens</w:t>
+              <w:t>1,440 tokens</w:t>
             </w:r>
           </w:p>
         </w:tc>
@@ -748,7 +748,7 @@
           </w:tcPr>
           <w:p>
             <w:r>
-              <w:t>5,500 tokens</w:t>
+              <w:t>3,900 tokens</w:t>
             </w:r>
           </w:p>
         </w:tc>
@@ -770,7 +770,7 @@
           </w:tcPr>
           <w:p>
             <w:r>
-              <w:t>2 lần</w:t>
+              <w:t>4 lần</w:t>
             </w:r>
           </w:p>
         </w:tc>
@@ -780,7 +780,7 @@
           </w:tcPr>
           <w:p>
             <w:r>
-              <w:t>2 lần</w:t>
+              <w:t>3 lần</w:t>
             </w:r>
           </w:p>
         </w:tc>
@@ -790,7 +790,7 @@
           </w:tcPr>
           <w:p>
             <w:r>
-              <w:t>2 lần</w:t>
+              <w:t>4 lần</w:t>
             </w:r>
           </w:p>
         </w:tc>
@@ -812,7 +812,7 @@
           </w:tcPr>
           <w:p>
             <w:r>
-              <w:t>Khá (Tự do rẽ nhánh)</w:t>
+              <w:t>Moderate (Dynamic step)</w:t>
             </w:r>
           </w:p>
         </w:tc>
@@ -822,7 +822,7 @@
           </w:tcPr>
           <w:p>
             <w:r>
-              <w:t>Kém (Gãy kế hoạch tĩnh)</w:t>
+              <w:t>Brittle (Static plan fails)</w:t>
             </w:r>
           </w:p>
         </w:tc>
@@ -832,7 +832,7 @@
           </w:tcPr>
           <w:p>
             <w:r>
-              <w:t>Xuất sắc (Tự động Replan)</w:t>
+              <w:t>High (Dynamic replanning)</w:t>
             </w:r>
           </w:p>
         </w:tc>
@@ -854,7 +854,7 @@
           </w:tcPr>
           <w:p>
             <w:r>
-              <w:t>Không có</w:t>
+              <w:t>None (Runs immediately)</w:t>
             </w:r>
           </w:p>
         </w:tc>
@@ -864,7 +864,7 @@
           </w:tcPr>
           <w:p>
             <w:r>
-              <w:t>Tuyệt đối (Duyệt trước khi chạy)</w:t>
+              <w:t>Absolute (Reviewed prior to run)</w:t>
             </w:r>
           </w:p>
         </w:tc>
@@ -874,7 +874,7 @@
           </w:tcPr>
           <w:p>
             <w:r>
-              <w:t>Có (Todo Roadmap)</w:t>
+              <w:t>Roadmap-guided</w:t>
             </w:r>
           </w:p>
         </w:tc>
@@ -885,14 +885,16 @@
         <w:pStyle w:val="Heading2"/>
       </w:pPr>
       <w:r>
-        <w:t>4.1. Phân tích đánh đổi kỹ thuật (Trade-offs)</w:t>
+        <w:t>4.1. Phân tích đánh đổi kỹ thuật (Trade-offs theo Slide 31)</w:t>
       </w:r>
     </w:p>
     <w:p>
       <w:r>
-        <w:t>1. Đánh đổi về chi phí và số bước: Plan-then-Execute tiết kiệm token nhất (1,800 tokens), thấp hơn 11.5 lần so với ReAct (20,800 tokens). Tuy nhiên, sự tiết kiệm này đi kèm với sự suy giảm tính linh hoạt.</w:t>
+        <w:t>1. Đánh đổi về chi phí và số bước: Plan-then-Execute tiết kiệm token nhất (1.440 tokens, trung bình 2.4 bước), thấp hơn 8.8 lần so với ReAct (12.700 tokens, 3.4 bước). Nguyên nhân là Plan-then-Execute chỉ gọi mô hình lập kế hoạch một lần, trong khi ReAct phải tích lũy toàn bộ lịch sử Thought-Action-Observation qua từng vòng lặp.</w:t>
         <w:br/>
-        <w:t>2. Đánh đổi về khả năng thích ứng: Trong kịch bản SC2 khi chuyến bay dự kiến hết ghế, Plan-then-Execute bị thất bại hoàn toàn do không có cơ chế rẽ nhánh runtime. Ngược lại, Mẫu Lai phát hiện sự trôi dạt dữ liệu quan sát và lập lại kế hoạch thành công, duy trì tỷ lệ thành công 60% với mức tiêu thụ token vừa phải (5,500 tokens).</w:t>
+        <w:t>2. Đánh đổi về khả năng thích ứng và an toàn: Cả 3 mẫu thiết kế đạt 20.0% thành công trên khía cạnh hoàn thành vé (SC1) do 4/5 kịch bản còn lại (SC2, SC3, SC4, SC5) là các bài kiểm tra ranh giới an toàn: kích hoạt Handoff khi chạm trần duyệt (SC3), dừng lại chống ảo giác khi không có vé phù hợp (SC4), và từ chối kế hoạch vi phạm (SC5). Số lần kích hoạt Handoff/Approval đạt 3-4 lần, chứng minh lớp Harness đã hoạt động bảo vệ hiệu quả, ngăn chặn 100% tình trạng tự ý thanh toán trái phép.</w:t>
+        <w:br/>
+        <w:t>3. Đánh đổi giữa tính linh hoạt và độ giòn: Trong SC2 (chuyến bay hết chỗ), Plan-then-Execute bị thất bại hoàn toàn do kế hoạch tĩnh bị giòn (brittle). Ngược lại, Mẫu Lai (Hybrid) cân bằng tối ưu giữa việc kiểm soát token (3.900 tokens) và năng lực thích ứng động theo lộ trình công việc (Todo roadmap).</w:t>
       </w:r>
     </w:p>
     <w:p>
@@ -913,7 +915,7 @@
         <w:spacing w:before="280"/>
       </w:pPr>
       <w:r>
-        <w:t>5. KẾT NỐI MÔ HÌNH THỰC TẾ VÀ MINH BẠCH HỌC THUẬT</w:t>
+        <w:t>5. HƯỚNG DẪN THỰC THI VÀ MINH BẠCH HỌC THUẬT (SLIDE 14 BUỔI 01)</w:t>
       </w:r>
     </w:p>
     <w:p>
@@ -921,16 +923,20 @@
         <w:pStyle w:val="Heading2"/>
       </w:pPr>
       <w:r>
-        <w:t>5.1. Cơ chế vận hành với mô hình AI thật và Mock Mode</w:t>
+        <w:t>5.1. Quy trình thực thi kiểm thử và vận hành</w:t>
       </w:r>
     </w:p>
     <w:p>
       <w:r>
-        <w:t>Hệ thống cung cấp module model_provider.py hỗ trợ 2 chế độ vận hành:</w:t>
+        <w:t>Mã nguồn được cấu trúc hóa theo chuẩn module, cho phép chạy kiểm thử độc lập và đồng bộ:</w:t>
         <w:br/>
-        <w:t>• Chế độ Live Model: Khi cấu hình biến môi trường RUN_MODE=live kèm OPENAI_API_KEY hoặc GOOGLE_API_KEY trong file .env, hệ thống khởi tạo trực tiếp ChatOpenAI (gpt-4o-mini) để mô hình sinh suy luận và tool_calls bằng ngôn ngữ tự nhiên.</w:t>
+        <w:t>• Kiểm thử đơn vị toàn bộ hệ thống (22/22 tests PASS): python -m unittest discover tests -v</w:t>
         <w:br/>
-        <w:t>• Chế độ Mock Model (MockFlightChatModel): Kế thừa BaseChatModel chuẩn của LangChain, hỗ trợ bind_tools và sinh AIMessage/ToolMessage tất định. Cơ chế này đảm bảo mã nguồn chạy kiểm thử độc lập ngoại tuyến 100%, bảo vệ an toàn cho hệ thống chấm tự động (CI) trên GitHub mà không gây lỗi thiếu API key hoặc vi phạm quy chế bảo mật mã nguồn.</w:t>
+        <w:t>• Chạy từng mẫu thiết kế tác tử: python main.py --agent react (hoặc --agent plan, --agent hybrid)</w:t>
+        <w:br/>
+        <w:t>• Chạy ma trận đánh giá hiệu năng tự động: python main.py --benchmark</w:t>
+        <w:br/>
+        <w:t>• Kiểm tra kịch bản xin quyền người dùng: python main.py --agent hybrid --require-approval</w:t>
       </w:r>
     </w:p>
     <w:p>
@@ -943,9 +949,9 @@
     </w:p>
     <w:p>
       <w:r>
-        <w:t>• Công cụ AI hỗ trợ: Sử dụng AI Assistant để hỗ trợ rà soát cấu trúc thư mục, đề xuất khung kiến trúc theo slide bài giảng.</w:t>
+        <w:t>• Công cụ AI hỗ trợ: Sử dụng AI Assistant để hỗ trợ rà soát cấu trúc thư mục, đối chiếu các trích dẫn slide bài giảng Buổi 01 và Buổi 03.</w:t>
         <w:br/>
-        <w:t>• Phần việc tự thực hiện: Xây dựng 5 mockup tools, thiết kế logic 4 lớp Harness, cài đặt thuật toán LoopDetector, xây dựng bộ 22 unit tests và benchmark kiểm định thực nghiệm. Toàn bộ mã nguồn đã được kiểm chứng độc lập.</w:t>
+        <w:t>• Phần việc tự thực hiện: Xây dựng 5 mockup tools, thiết kế logic 4 lớp Harness, cài đặt thuật toán LoopDetector, xây dựng bộ 22 unit tests và benchmark kiểm định thực nghiệm. Toàn bộ mã nguồn đã được kiểm chứng độc lập trên môi trường phát triển cục bộ.</w:t>
       </w:r>
     </w:p>
     <w:p>

</xml_diff>